<commit_message>
Update Finance Manager and Bookkeeper JDs: Finance Manager now explicitly owns payroll service, expense report approval, and vendor payments. Bookkeeper now has payroll processing as required qualification (moved from preferred). Position summaries updated for both roles.
</commit_message>
<xml_diff>
--- a/careers/jds/Batch7_JDs_Operations_and_Development.docx
+++ b/careers/jds/Batch7_JDs_Operations_and_Development.docx
@@ -1947,7 +1947,7 @@
           <w:sz w:val="22"/>
           <w:szCs w:val="22"/>
         </w:rPr>
-        <w:t xml:space="preserve">The Finance Manager manages the lab's budget, tracks grant spending, handles accounts payable and receivable, and produces the financial reports that funders, the board, and the CEO rely on. Grant funders specifically require financial accountability and reporting, and this role is the person who ensures every dollar is tracked, allocated, and documented correctly.</w:t>
+        <w:t xml:space="preserve">The Finance Manager manages the lab’s budget, tracks grant spending, handles accounts payable and receivable, owns the payroll function, approves all expense reports and vendor payments, and produces the financial reports that funders, the board, and the CEO rely on. Grant funders specifically require financial accountability and reporting, and this role is the person who ensures every dollar is tracked, allocated, and documented correctly. The CEO should never have to think about whether payroll ran, whether a vendor got paid, or whether a grant report is on time. That is your job.</w:t>
       </w:r>
     </w:p>
     <w:p>
@@ -2030,7 +2030,25 @@
           <w:sz w:val="22"/>
           <w:szCs w:val="22"/>
         </w:rPr>
-        <w:t xml:space="preserve">Oversee accounts payable, accounts receivable, and payroll coordination.</w:t>
+        <w:t xml:space="preserve">Own the payroll function: select and manage the payroll service (Gusto, ADP, or equivalent), ensure every employee is paid correctly and on time, and oversee all payroll tax compliance and reporting.</w:t>
+      </w:r>
+    </w:p>
+    <w:p>
+      <w:pPr>
+        <w:pStyle w:val="ListParagraph"/>
+        <w:numPr>
+          <w:ilvl w:val="0"/>
+          <w:numId w:val="2"/>
+        </w:numPr>
+        <w:spacing w:after="80"/>
+      </w:pPr>
+      <w:r>
+        <w:rPr>
+          <w:rFonts w:ascii="Arial" w:cs="Arial" w:eastAsia="Arial" w:hAnsi="Arial"/>
+          <w:sz w:val="22"/>
+          <w:szCs w:val="22"/>
+        </w:rPr>
+        <w:t xml:space="preserve">Approve all expense reports, vendor invoices, and reimbursements before payment. Manage accounts payable and accounts receivable.</w:t>
       </w:r>
     </w:p>
     <w:p>
@@ -3311,7 +3329,7 @@
           <w:sz w:val="22"/>
           <w:szCs w:val="22"/>
         </w:rPr>
-        <w:t xml:space="preserve">The Bookkeeper handles the daily financial record-keeping that supports the Finance Manager: processing invoices, coding transactions, reconciling accounts, and maintaining clean books that make monthly closes and grant reporting possible.</w:t>
+        <w:t xml:space="preserve">The Bookkeeper handles the daily financial record-keeping that supports the Finance Manager: processing invoices, coding transactions, reconciling accounts, processing payroll inputs into the payroll service, and maintaining clean books that make monthly closes and grant reporting possible.</w:t>
       </w:r>
     </w:p>
     <w:p>
@@ -3412,7 +3430,7 @@
           <w:sz w:val="22"/>
           <w:szCs w:val="22"/>
         </w:rPr>
-        <w:t xml:space="preserve">Process payroll-related entries in coordination with the HR Manager.</w:t>
+        <w:t xml:space="preserve">Process payroll inputs: new hire entries, hour adjustments, and employee changes into the payroll service. Reconcile payroll records against the books after each pay cycle. Coordinate with the HR Manager on any payroll-affecting changes.</w:t>
       </w:r>
     </w:p>
     <w:p>
@@ -3647,6 +3665,24 @@
     </w:p>
     <w:p>
       <w:pPr>
+        <w:pStyle w:val="ListParagraph"/>
+        <w:numPr>
+          <w:ilvl w:val="0"/>
+          <w:numId w:val="2"/>
+        </w:numPr>
+        <w:spacing w:after="80"/>
+      </w:pPr>
+      <w:r>
+        <w:rPr>
+          <w:rFonts w:ascii="Arial" w:cs="Arial" w:eastAsia="Arial" w:hAnsi="Arial"/>
+          <w:sz w:val="22"/>
+          <w:szCs w:val="22"/>
+        </w:rPr>
+        <w:t xml:space="preserve">Experience with payroll processing and payroll service platforms (Gusto, ADP, Paychex, or equivalent).</w:t>
+      </w:r>
+    </w:p>
+    <w:p>
+      <w:pPr>
         <w:spacing w:after="80"/>
       </w:pPr>
     </w:p>
@@ -3700,24 +3736,6 @@
           <w:szCs w:val="22"/>
         </w:rPr>
         <w:t xml:space="preserve">Experience with multi-entity bookkeeping.</w:t>
-      </w:r>
-    </w:p>
-    <w:p>
-      <w:pPr>
-        <w:pStyle w:val="ListParagraph"/>
-        <w:numPr>
-          <w:ilvl w:val="0"/>
-          <w:numId w:val="2"/>
-        </w:numPr>
-        <w:spacing w:after="80"/>
-      </w:pPr>
-      <w:r>
-        <w:rPr>
-          <w:rFonts w:ascii="Arial" w:cs="Arial" w:eastAsia="Arial" w:hAnsi="Arial"/>
-          <w:sz w:val="22"/>
-          <w:szCs w:val="22"/>
-        </w:rPr>
-        <w:t xml:space="preserve">Familiarity with payroll processing.</w:t>
       </w:r>
     </w:p>
     <w:p>

</xml_diff>